<commit_message>
Plotted mined SST data distribution
</commit_message>
<xml_diff>
--- a/AC_essential/Jul2026_data_mining/README.docx
+++ b/AC_essential/Jul2026_data_mining/README.docx
@@ -95,7 +95,28 @@
           <w:color w:val="555555"/>
           <w:sz w:val="20"/>
         </w:rPr>
-        <w:t>Compiled 21 July 2026</w:t>
+        <w:t>Compiled July</w:t>
+      </w:r>
+      <w:r>
+        <w:rPr>
+          <w:color w:val="555555"/>
+          <w:sz w:val="20"/>
+        </w:rPr>
+        <w:t xml:space="preserve"> 24,</w:t>
+      </w:r>
+      <w:r>
+        <w:rPr>
+          <w:color w:val="555555"/>
+          <w:sz w:val="20"/>
+        </w:rPr>
+        <w:t xml:space="preserve"> </w:t>
+      </w:r>
+      <w:r>
+        <w:rPr>
+          <w:color w:val="555555"/>
+          <w:sz w:val="20"/>
+        </w:rPr>
+        <w:t>2026,</w:t>
       </w:r>
       <w:r>
         <w:rPr>
@@ -158,6 +179,7 @@
         <w:t>, covering Termination II (the penultimate deglaciation). 57 of the 66 records in the main sheet carry data beyond 130 ka, so they also constrain the interval over which the reconstruction is currently unconstrained.</w:t>
       </w:r>
     </w:p>
+    <w:p/>
     <w:p>
       <w:pPr>
         <w:pStyle w:val="Heading1"/>
@@ -240,6 +262,7 @@
         <w:rPr>
           <w:b/>
         </w:rPr>
+        <w:lastRenderedPageBreak/>
         <w:t>SST_Hoffman_Harmonized_AC_ES_no_V28_238.xlsx</w:t>
       </w:r>
     </w:p>
@@ -249,7 +272,6 @@
         <w:ind w:left="360"/>
       </w:pPr>
       <w:r>
-        <w:lastRenderedPageBreak/>
         <w:t xml:space="preserve">The Hoffman et al. (2017) compilation, </w:t>
       </w:r>
       <w:r>
@@ -313,6 +335,11 @@
     </w:p>
     <w:p>
       <w:pPr>
+        <w:spacing w:after="160"/>
+      </w:pPr>
+    </w:p>
+    <w:p>
+      <w:pPr>
         <w:pStyle w:val="Heading1"/>
         <w:spacing w:before="320" w:after="120"/>
       </w:pPr>
@@ -327,7 +354,93 @@
     </w:p>
     <w:p>
       <w:r>
-        <w:t>Cores are assigned to a basin geometrically from longitude and latitude. “Southern Ocean” is taken as south of roughly 40°S and “Arctic” as north of 66.5°N. The exact boundaries matter little for these totals — the table is meant to show where the data are, and where they are not.</w:t>
+        <w:t xml:space="preserve">Each mined core </w:t>
+      </w:r>
+      <w:r>
+        <w:t xml:space="preserve">has </w:t>
+      </w:r>
+      <w:r>
+        <w:t>longitude and latitude coordinate</w:t>
+      </w:r>
+      <w:r>
+        <w:t xml:space="preserve"> pairs recorded, which can be visualized below.</w:t>
+      </w:r>
+    </w:p>
+    <w:p>
+      <w:pPr>
+        <w:jc w:val="center"/>
+      </w:pPr>
+      <w:r>
+        <w:drawing>
+          <wp:inline distT="0" distB="0" distL="0" distR="0" wp14:anchorId="44583850" wp14:editId="1FF9F832">
+            <wp:extent cx="6217920" cy="3484245"/>
+            <wp:effectExtent l="0" t="0" r="5080" b="0"/>
+            <wp:docPr id="1351468273" name="Picture 1"/>
+            <wp:cNvGraphicFramePr>
+              <a:graphicFrameLocks xmlns:a="http://schemas.openxmlformats.org/drawingml/2006/main" noChangeAspect="1"/>
+            </wp:cNvGraphicFramePr>
+            <a:graphic xmlns:a="http://schemas.openxmlformats.org/drawingml/2006/main">
+              <a:graphicData uri="http://schemas.openxmlformats.org/drawingml/2006/picture">
+                <pic:pic xmlns:pic="http://schemas.openxmlformats.org/drawingml/2006/picture">
+                  <pic:nvPicPr>
+                    <pic:cNvPr id="1351468273" name=""/>
+                    <pic:cNvPicPr/>
+                  </pic:nvPicPr>
+                  <pic:blipFill>
+                    <a:blip r:embed="rId6"/>
+                    <a:stretch>
+                      <a:fillRect/>
+                    </a:stretch>
+                  </pic:blipFill>
+                  <pic:spPr>
+                    <a:xfrm>
+                      <a:off x="0" y="0"/>
+                      <a:ext cx="6217920" cy="3484245"/>
+                    </a:xfrm>
+                    <a:prstGeom prst="rect">
+                      <a:avLst/>
+                    </a:prstGeom>
+                  </pic:spPr>
+                </pic:pic>
+              </a:graphicData>
+            </a:graphic>
+          </wp:inline>
+        </w:drawing>
+      </w:r>
+    </w:p>
+    <w:p>
+      <w:pPr>
+        <w:rPr>
+          <w:i/>
+          <w:iCs/>
+        </w:rPr>
+      </w:pPr>
+      <w:r>
+        <w:rPr>
+          <w:i/>
+          <w:iCs/>
+        </w:rPr>
+        <w:t xml:space="preserve">Figure 1. Distribution of mined coordinates over 115-140 ka. Markers show all mined data of any length, i.e. regardless of the number of data points the core has within 115-140 ka. </w:t>
+      </w:r>
+      <w:r>
+        <w:rPr>
+          <w:i/>
+          <w:iCs/>
+        </w:rPr>
+        <w:t>Updated on July 24, 2026.</w:t>
+      </w:r>
+    </w:p>
+    <w:p>
+      <w:pPr>
+        <w:spacing w:after="200"/>
+      </w:pPr>
+    </w:p>
+    <w:p>
+      <w:r>
+        <w:t xml:space="preserve">Equivalently, the geographic distribution may be displayed statistically and compared across basins. </w:t>
+      </w:r>
+      <w:r>
+        <w:t>Southern Ocean” is taken as south of roughly 40°S and “Arctic” as north of 66.5°N.</w:t>
       </w:r>
     </w:p>
     <w:tbl>
@@ -368,6 +481,7 @@
                 <w:color w:val="FFFFFF"/>
                 <w:sz w:val="18"/>
               </w:rPr>
+              <w:lastRenderedPageBreak/>
               <w:t>Basin</w:t>
             </w:r>
           </w:p>
@@ -1654,11 +1768,7 @@
         <w:t>.</w:t>
       </w:r>
     </w:p>
-    <w:p>
-      <w:r>
-        <w:br w:type="page"/>
-      </w:r>
-    </w:p>
+    <w:p/>
     <w:p>
       <w:pPr>
         <w:pStyle w:val="Heading1"/>
@@ -1670,7 +1780,6 @@
           <w:color w:val="1F3B5C"/>
           <w:sz w:val="30"/>
         </w:rPr>
-        <w:lastRenderedPageBreak/>
         <w:t>4. Column dictionary</w:t>
       </w:r>
     </w:p>
@@ -2140,7 +2249,14 @@
               <w:rPr>
                 <w:sz w:val="18"/>
               </w:rPr>
-              <w:t>The raw measured index behind the SST — the UK'37 ratio, the Mg/Ca in mmol/mol, the TEX86 value. Retained so any calibration can be revisited without returning to the source file.</w:t>
+              <w:t xml:space="preserve">The raw measured index behind the SST — the UK'37 ratio, the Mg/Ca in mmol/mol, the </w:t>
+            </w:r>
+            <w:r>
+              <w:rPr>
+                <w:sz w:val="18"/>
+              </w:rPr>
+              <w:lastRenderedPageBreak/>
+              <w:t>TEX86 value. Retained so any calibration can be revisited without returning to the source file.</w:t>
             </w:r>
           </w:p>
         </w:tc>
@@ -2162,6 +2278,7 @@
               <w:rPr>
                 <w:sz w:val="18"/>
               </w:rPr>
+              <w:lastRenderedPageBreak/>
               <w:t>P</w:t>
             </w:r>
           </w:p>
@@ -2763,11 +2880,7 @@
         <w:t xml:space="preserve"> uses the same layout with column R (Age) empty by definition, and adds SSTwarm and SSTcold columns for the faunal records that report two seasons.</w:t>
       </w:r>
     </w:p>
-    <w:p>
-      <w:r>
-        <w:br w:type="page"/>
-      </w:r>
-    </w:p>
+    <w:p/>
     <w:p>
       <w:pPr>
         <w:pStyle w:val="Heading1"/>
@@ -2779,7 +2892,6 @@
           <w:color w:val="1F3B5C"/>
           <w:sz w:val="30"/>
         </w:rPr>
-        <w:lastRenderedPageBreak/>
         <w:t>5. Methodological decisions</w:t>
       </w:r>
     </w:p>
@@ -2867,6 +2979,7 @@
         <w:spacing w:after="80"/>
       </w:pPr>
       <w:r>
+        <w:lastRenderedPageBreak/>
         <w:t>Cores currently flagged summer: U939, MD99-2331 (both proxies), PS1778-5, RS147-GC14 and SO136-111. MD04-2845 sat in this group until its JFM column was found; it is now an aug-feb average.</w:t>
       </w:r>
     </w:p>
@@ -3106,14 +3219,7 @@
               <w:rPr>
                 <w:sz w:val="18"/>
               </w:rPr>
-              <w:t xml:space="preserve">Doubled. An unlabelled error column is assumed to be 1sd, which is the common </w:t>
-            </w:r>
-            <w:r>
-              <w:rPr>
-                <w:sz w:val="18"/>
-              </w:rPr>
-              <w:lastRenderedPageBreak/>
-              <w:t>convention; the assumption is stated in column Y.</w:t>
+              <w:t>Doubled. An unlabelled error column is assumed to be 1sd, which is the common convention; the assumption is stated in column Y.</w:t>
             </w:r>
           </w:p>
         </w:tc>
@@ -3134,7 +3240,6 @@
               <w:rPr>
                 <w:sz w:val="18"/>
               </w:rPr>
-              <w:lastRenderedPageBreak/>
               <w:t>A 90% credible interval (Bayesian calibration)</w:t>
             </w:r>
           </w:p>
@@ -3299,6 +3404,7 @@
         <w:spacing w:after="80"/>
       </w:pPr>
       <w:r>
+        <w:lastRenderedPageBreak/>
         <w:t>Temperature is always °C, and values are accepted only within −5 to +40 °C. The lower bound is deliberately below 0 °C.</w:t>
       </w:r>
     </w:p>
@@ -3421,7 +3527,6 @@
           <w:color w:val="1F3B5C"/>
           <w:sz w:val="25"/>
         </w:rPr>
-        <w:lastRenderedPageBreak/>
         <w:t>5.7  What was rejected, and why</w:t>
       </w:r>
     </w:p>
@@ -3748,6 +3853,7 @@
         <w:spacing w:after="80"/>
       </w:pPr>
       <w:r>
+        <w:lastRenderedPageBreak/>
         <w:t>Every tab records its source URL (column W) and its parsing decisions (column Y). Nothing in the spreadsheets is untraceable.</w:t>
       </w:r>
     </w:p>
@@ -3775,11 +3881,7 @@
         <w:t>Coordinate sanity was checked against the basin named in each study.</w:t>
       </w:r>
     </w:p>
-    <w:p>
-      <w:r>
-        <w:br w:type="page"/>
-      </w:r>
-    </w:p>
+    <w:p/>
     <w:p>
       <w:pPr>
         <w:pStyle w:val="Heading1"/>
@@ -3791,7 +3893,6 @@
           <w:color w:val="1F3B5C"/>
           <w:sz w:val="30"/>
         </w:rPr>
-        <w:lastRenderedPageBreak/>
         <w:t>6. Caveats before you use these data</w:t>
       </w:r>
     </w:p>
@@ -3887,6 +3988,16 @@
       <w:r>
         <w:t>For V19-29 the NCEI latitude (−3.57) supersedes the −3.25 in the original sheet; for NH22P the original value (22.52) is correct against NCEI's 23.52. Both are noted here so that a future user does not silently “correct” the wrong one.</w:t>
       </w:r>
+    </w:p>
+    <w:p>
+      <w:pPr>
+        <w:pStyle w:val="ListBullet"/>
+        <w:numPr>
+          <w:ilvl w:val="0"/>
+          <w:numId w:val="0"/>
+        </w:numPr>
+        <w:spacing w:after="80"/>
+      </w:pPr>
     </w:p>
     <w:p>
       <w:pPr>
@@ -3993,6 +4104,7 @@
           <w:color w:val="555555"/>
           <w:sz w:val="20"/>
         </w:rPr>
+        <w:lastRenderedPageBreak/>
         <w:t>Questions about any individual record should start with column Y of that tab, which records the reasoning behind every value in it.</w:t>
       </w:r>
     </w:p>

</xml_diff>